<commit_message>
Sample therapist_urls scraping done
</commit_message>
<xml_diff>
--- a/01_Project Description.docx
+++ b/01_Project Description.docx
@@ -533,7 +533,36 @@
         <w:t>All emails verified (&lt;5% bounce rate)</w:t>
       </w:r>
     </w:p>
-    <w:p/>
+    <w:p>
+      <w:r>
+        <w:lastRenderedPageBreak/>
+        <w:t># Plan to scrape</w:t>
+      </w:r>
+    </w:p>
+    <w:p>
+      <w:pPr>
+        <w:pStyle w:val="ListParagraph"/>
+        <w:numPr>
+          <w:ilvl w:val="0"/>
+          <w:numId w:val="2"/>
+        </w:numPr>
+      </w:pPr>
+      <w:r>
+        <w:t>Scrape all Therapist url from all page (1-66 pages) and store them</w:t>
+      </w:r>
+    </w:p>
+    <w:p>
+      <w:pPr>
+        <w:pStyle w:val="ListParagraph"/>
+        <w:numPr>
+          <w:ilvl w:val="0"/>
+          <w:numId w:val="2"/>
+        </w:numPr>
+      </w:pPr>
+      <w:r>
+        <w:t>Click all therapist</w:t>
+      </w:r>
+    </w:p>
     <w:sectPr>
       <w:pgSz w:w="12240" w:h="15840"/>
       <w:pgMar w:top="1440" w:right="1440" w:bottom="1440" w:left="1440" w:header="720" w:footer="720" w:gutter="0"/>
@@ -547,6 +576,95 @@
 <file path=word/numbering.xml><?xml version="1.0" encoding="utf-8"?>
 <w:numbering xmlns:wpc="http://schemas.microsoft.com/office/word/2010/wordprocessingCanvas" xmlns:cx="http://schemas.microsoft.com/office/drawing/2014/chartex" xmlns:cx1="http://schemas.microsoft.com/office/drawing/2015/9/8/chartex" xmlns:cx2="http://schemas.microsoft.com/office/drawing/2015/10/21/chartex" xmlns:cx3="http://schemas.microsoft.com/office/drawing/2016/5/9/chartex" xmlns:cx4="http://schemas.microsoft.com/office/drawing/2016/5/10/chartex" xmlns:cx5="http://schemas.microsoft.com/office/drawing/2016/5/11/chartex" xmlns:cx6="http://schemas.microsoft.com/office/drawing/2016/5/12/chartex" xmlns:cx7="http://schemas.microsoft.com/office/drawing/2016/5/13/chartex" xmlns:cx8="http://schemas.microsoft.com/office/drawing/2016/5/14/chartex" xmlns:mc="http://schemas.openxmlformats.org/markup-compatibility/2006" xmlns:aink="http://schemas.microsoft.com/office/drawing/2016/ink" xmlns:am3d="http://schemas.microsoft.com/office/drawing/2017/model3d" xmlns:o="urn:schemas-microsoft-com:office:office" xmlns:r="http://schemas.openxmlformats.org/officeDocument/2006/relationships" xmlns:m="http://schemas.openxmlformats.org/officeDocument/2006/math" xmlns:v="urn:schemas-microsoft-com:vml" xmlns:wp14="http://schemas.microsoft.com/office/word/2010/wordprocessingDrawing" xmlns:wp="http://schemas.openxmlformats.org/drawingml/2006/wordprocessingDrawing" xmlns:w10="urn:schemas-microsoft-com:office:word" xmlns:w="http://schemas.openxmlformats.org/wordprocessingml/2006/main" xmlns:w14="http://schemas.microsoft.com/office/word/2010/wordml" xmlns:w15="http://schemas.microsoft.com/office/word/2012/wordml" xmlns:w16cex="http://schemas.microsoft.com/office/word/2018/wordml/cex" xmlns:w16cid="http://schemas.microsoft.com/office/word/2016/wordml/cid" xmlns:w16="http://schemas.microsoft.com/office/word/2018/wordml" xmlns:w16se="http://schemas.microsoft.com/office/word/2015/wordml/symex" xmlns:wpg="http://schemas.microsoft.com/office/word/2010/wordprocessingGroup" xmlns:wpi="http://schemas.microsoft.com/office/word/2010/wordprocessingInk" xmlns:wne="http://schemas.microsoft.com/office/word/2006/wordml" xmlns:wps="http://schemas.microsoft.com/office/word/2010/wordprocessingShape" mc:Ignorable="w14 w15 w16se w16cid w16 w16cex wp14">
   <w:abstractNum w:abstractNumId="0" w15:restartNumberingAfterBreak="0">
+    <w:nsid w:val="1AA604EF"/>
+    <w:multiLevelType w:val="hybridMultilevel"/>
+    <w:tmpl w:val="36E8D584"/>
+    <w:lvl w:ilvl="0" w:tplc="0409000F">
+      <w:start w:val="1"/>
+      <w:numFmt w:val="decimal"/>
+      <w:lvlText w:val="%1."/>
+      <w:lvlJc w:val="left"/>
+      <w:pPr>
+        <w:ind w:left="720" w:hanging="360"/>
+      </w:pPr>
+      <w:rPr>
+        <w:rFonts w:hint="default"/>
+      </w:rPr>
+    </w:lvl>
+    <w:lvl w:ilvl="1" w:tplc="04090019" w:tentative="1">
+      <w:start w:val="1"/>
+      <w:numFmt w:val="lowerLetter"/>
+      <w:lvlText w:val="%2."/>
+      <w:lvlJc w:val="left"/>
+      <w:pPr>
+        <w:ind w:left="1440" w:hanging="360"/>
+      </w:pPr>
+    </w:lvl>
+    <w:lvl w:ilvl="2" w:tplc="0409001B" w:tentative="1">
+      <w:start w:val="1"/>
+      <w:numFmt w:val="lowerRoman"/>
+      <w:lvlText w:val="%3."/>
+      <w:lvlJc w:val="right"/>
+      <w:pPr>
+        <w:ind w:left="2160" w:hanging="180"/>
+      </w:pPr>
+    </w:lvl>
+    <w:lvl w:ilvl="3" w:tplc="0409000F" w:tentative="1">
+      <w:start w:val="1"/>
+      <w:numFmt w:val="decimal"/>
+      <w:lvlText w:val="%4."/>
+      <w:lvlJc w:val="left"/>
+      <w:pPr>
+        <w:ind w:left="2880" w:hanging="360"/>
+      </w:pPr>
+    </w:lvl>
+    <w:lvl w:ilvl="4" w:tplc="04090019" w:tentative="1">
+      <w:start w:val="1"/>
+      <w:numFmt w:val="lowerLetter"/>
+      <w:lvlText w:val="%5."/>
+      <w:lvlJc w:val="left"/>
+      <w:pPr>
+        <w:ind w:left="3600" w:hanging="360"/>
+      </w:pPr>
+    </w:lvl>
+    <w:lvl w:ilvl="5" w:tplc="0409001B" w:tentative="1">
+      <w:start w:val="1"/>
+      <w:numFmt w:val="lowerRoman"/>
+      <w:lvlText w:val="%6."/>
+      <w:lvlJc w:val="right"/>
+      <w:pPr>
+        <w:ind w:left="4320" w:hanging="180"/>
+      </w:pPr>
+    </w:lvl>
+    <w:lvl w:ilvl="6" w:tplc="0409000F" w:tentative="1">
+      <w:start w:val="1"/>
+      <w:numFmt w:val="decimal"/>
+      <w:lvlText w:val="%7."/>
+      <w:lvlJc w:val="left"/>
+      <w:pPr>
+        <w:ind w:left="5040" w:hanging="360"/>
+      </w:pPr>
+    </w:lvl>
+    <w:lvl w:ilvl="7" w:tplc="04090019" w:tentative="1">
+      <w:start w:val="1"/>
+      <w:numFmt w:val="lowerLetter"/>
+      <w:lvlText w:val="%8."/>
+      <w:lvlJc w:val="left"/>
+      <w:pPr>
+        <w:ind w:left="5760" w:hanging="360"/>
+      </w:pPr>
+    </w:lvl>
+    <w:lvl w:ilvl="8" w:tplc="0409001B" w:tentative="1">
+      <w:start w:val="1"/>
+      <w:numFmt w:val="lowerRoman"/>
+      <w:lvlText w:val="%9."/>
+      <w:lvlJc w:val="right"/>
+      <w:pPr>
+        <w:ind w:left="6480" w:hanging="180"/>
+      </w:pPr>
+    </w:lvl>
+  </w:abstractNum>
+  <w:abstractNum w:abstractNumId="1" w15:restartNumberingAfterBreak="0">
     <w:nsid w:val="2B407759"/>
     <w:multiLevelType w:val="multilevel"/>
     <w:tmpl w:val="C8DE844E"/>
@@ -696,6 +814,9 @@
     </w:lvl>
   </w:abstractNum>
   <w:num w:numId="1">
+    <w:abstractNumId w:val="1"/>
+  </w:num>
+  <w:num w:numId="2">
     <w:abstractNumId w:val="0"/>
   </w:num>
 </w:numbering>
@@ -1237,6 +1358,17 @@
       <w:u w:val="single"/>
     </w:rPr>
   </w:style>
+  <w:style w:type="paragraph" w:styleId="ListParagraph">
+    <w:name w:val="List Paragraph"/>
+    <w:basedOn w:val="Normal"/>
+    <w:uiPriority w:val="34"/>
+    <w:qFormat/>
+    <w:rsid w:val="004B1D8A"/>
+    <w:pPr>
+      <w:ind w:left="720"/>
+      <w:contextualSpacing/>
+    </w:pPr>
+  </w:style>
 </w:styles>
 </file>
 

</xml_diff>

<commit_message>
Database Connection setup Done
</commit_message>
<xml_diff>
--- a/01_Project Description.docx
+++ b/01_Project Description.docx
@@ -561,6 +561,11 @@
       </w:pPr>
       <w:r>
         <w:t>Click all therapist</w:t>
+      </w:r>
+    </w:p>
+    <w:p>
+      <w:r>
+        <w:t># Create a Database. And insert therapist list from each page</w:t>
       </w:r>
     </w:p>
     <w:sectPr>

</xml_diff>